<commit_message>
Thesis revisions: pages 6, 7 and 9
94.3% becomes a benchmark FETCH measures itself against, the automatic reorder
is described as the system does it, and ScanBarcode becomes Barcode Scanning.
Chapters 1 and 2 stay in the future tense.

Co-Authored-By: Claude Opus 5.5 <noreply@anthropic.com>
</commit_message>
<xml_diff>
--- a/Thesis Paper/FETCH-Thesis-Revisions.docx
+++ b/Thesis Paper/FETCH-Thesis-Revisions.docx
@@ -1416,6 +1416,207 @@
           </w:p>
         </w:tc>
       </w:tr>
+      <w:tr>
+        <w:tc>
+          <w:tcPr>
+            <w:tcW w:type="dxa" w:w="1872"/>
+          </w:tcPr>
+          <w:p>
+            <w:r>
+              <w:rPr>
+                <w:sz w:val="19"/>
+              </w:rPr>
+              <w:t>20</w:t>
+            </w:r>
+          </w:p>
+        </w:tc>
+        <w:tc>
+          <w:tcPr>
+            <w:tcW w:type="dxa" w:w="1872"/>
+          </w:tcPr>
+          <w:p>
+            <w:r>
+              <w:rPr>
+                <w:sz w:val="19"/>
+              </w:rPr>
+              <w:t>6</w:t>
+            </w:r>
+          </w:p>
+        </w:tc>
+        <w:tc>
+          <w:tcPr>
+            <w:tcW w:type="dxa" w:w="1872"/>
+          </w:tcPr>
+          <w:p>
+            <w:r>
+              <w:rPr>
+                <w:sz w:val="19"/>
+              </w:rPr>
+              <w:t>Machine Learning Applications</w:t>
+            </w:r>
+          </w:p>
+        </w:tc>
+        <w:tc>
+          <w:tcPr>
+            <w:tcW w:type="dxa" w:w="1872"/>
+          </w:tcPr>
+          <w:p>
+            <w:r>
+              <w:rPr>
+                <w:sz w:val="19"/>
+              </w:rPr>
+              <w:t>94.3% becomes a benchmark FETCH measures itself against</w:t>
+            </w:r>
+          </w:p>
+        </w:tc>
+        <w:tc>
+          <w:tcPr>
+            <w:tcW w:type="dxa" w:w="1872"/>
+          </w:tcPr>
+          <w:p>
+            <w:r>
+              <w:rPr>
+                <w:sz w:val="19"/>
+              </w:rPr>
+              <w:t>The system measured 86.1%</w:t>
+            </w:r>
+          </w:p>
+        </w:tc>
+      </w:tr>
+      <w:tr>
+        <w:tc>
+          <w:tcPr>
+            <w:tcW w:type="dxa" w:w="1872"/>
+          </w:tcPr>
+          <w:p>
+            <w:r>
+              <w:rPr>
+                <w:sz w:val="19"/>
+              </w:rPr>
+              <w:t>21</w:t>
+            </w:r>
+          </w:p>
+        </w:tc>
+        <w:tc>
+          <w:tcPr>
+            <w:tcW w:type="dxa" w:w="1872"/>
+          </w:tcPr>
+          <w:p>
+            <w:r>
+              <w:rPr>
+                <w:sz w:val="19"/>
+              </w:rPr>
+              <w:t>7</w:t>
+            </w:r>
+          </w:p>
+        </w:tc>
+        <w:tc>
+          <w:tcPr>
+            <w:tcW w:type="dxa" w:w="1872"/>
+          </w:tcPr>
+          <w:p>
+            <w:r>
+              <w:rPr>
+                <w:sz w:val="19"/>
+              </w:rPr>
+              <w:t>Predictive Analytics and AI-Driven Forecasting</w:t>
+            </w:r>
+          </w:p>
+        </w:tc>
+        <w:tc>
+          <w:tcPr>
+            <w:tcW w:type="dxa" w:w="1872"/>
+          </w:tcPr>
+          <w:p>
+            <w:r>
+              <w:rPr>
+                <w:sz w:val="19"/>
+              </w:rPr>
+              <w:t>Say what the automatic reorder does</w:t>
+            </w:r>
+          </w:p>
+        </w:tc>
+        <w:tc>
+          <w:tcPr>
+            <w:tcW w:type="dxa" w:w="1872"/>
+          </w:tcPr>
+          <w:p>
+            <w:r>
+              <w:rPr>
+                <w:sz w:val="19"/>
+              </w:rPr>
+              <w:t>Matches the system</w:t>
+            </w:r>
+          </w:p>
+        </w:tc>
+      </w:tr>
+      <w:tr>
+        <w:tc>
+          <w:tcPr>
+            <w:tcW w:type="dxa" w:w="1872"/>
+          </w:tcPr>
+          <w:p>
+            <w:r>
+              <w:rPr>
+                <w:sz w:val="19"/>
+              </w:rPr>
+              <w:t>22</w:t>
+            </w:r>
+          </w:p>
+        </w:tc>
+        <w:tc>
+          <w:tcPr>
+            <w:tcW w:type="dxa" w:w="1872"/>
+          </w:tcPr>
+          <w:p>
+            <w:r>
+              <w:rPr>
+                <w:sz w:val="19"/>
+              </w:rPr>
+              <w:t>9</w:t>
+            </w:r>
+          </w:p>
+        </w:tc>
+        <w:tc>
+          <w:tcPr>
+            <w:tcW w:type="dxa" w:w="1872"/>
+          </w:tcPr>
+          <w:p>
+            <w:r>
+              <w:rPr>
+                <w:sz w:val="19"/>
+              </w:rPr>
+              <w:t>Pet Retail Industry</w:t>
+            </w:r>
+          </w:p>
+        </w:tc>
+        <w:tc>
+          <w:tcPr>
+            <w:tcW w:type="dxa" w:w="1872"/>
+          </w:tcPr>
+          <w:p>
+            <w:r>
+              <w:rPr>
+                <w:sz w:val="19"/>
+              </w:rPr>
+              <w:t>"ScanBarcode" becomes "Barcode Scanning"</w:t>
+            </w:r>
+          </w:p>
+        </w:tc>
+        <w:tc>
+          <w:tcPr>
+            <w:tcW w:type="dxa" w:w="1872"/>
+          </w:tcPr>
+          <w:p>
+            <w:r>
+              <w:rPr>
+                <w:sz w:val="19"/>
+              </w:rPr>
+              <w:t>Clearer wording</w:t>
+            </w:r>
+          </w:p>
+        </w:tc>
+      </w:tr>
     </w:tbl>
     <w:p>
       <w:pPr>
@@ -3320,6 +3521,192 @@
           <w:color w:val="0F2E17"/>
           <w:sz w:val="28"/>
         </w:rPr>
+        <w:t>20. Machine Learning Applications in Inventory Management: the 94.3% (page 6)</w:t>
+      </w:r>
+    </w:p>
+    <w:p>
+      <w:pPr>
+        <w:spacing w:after="60"/>
+      </w:pPr>
+      <w:r>
+        <w:rPr>
+          <w:b/>
+          <w:sz w:val="22"/>
+        </w:rPr>
+        <w:t xml:space="preserve">Why: </w:t>
+      </w:r>
+      <w:r>
+        <w:rPr>
+          <w:sz w:val="22"/>
+        </w:rPr>
+        <w:t>"The FETCH system focuses on achieving this validated accuracy level of 94.3%" promises a figure from another study, made on 50 other stores. FETCH measures its own forecast accuracy on the Stock planning page, and the last measurement was 86.1% (27 September to 10 October 2026). If the paper promises 94.3%, the panel can ask why the system does not reach it. Written as below, 94.3% is the benchmark from the literature, and the paper only promises what FETCH really does: use the same two algorithms and measure itself against that figure. Your actual result then goes in Chapter 3.</w:t>
+      </w:r>
+    </w:p>
+    <w:p>
+      <w:pPr>
+        <w:spacing w:after="60"/>
+      </w:pPr>
+      <w:r>
+        <w:rPr>
+          <w:b/>
+          <w:sz w:val="22"/>
+        </w:rPr>
+        <w:t xml:space="preserve">Replace the last sentence of the paragraph </w:t>
+      </w:r>
+      <w:r>
+        <w:rPr>
+          <w:sz w:val="22"/>
+        </w:rPr>
+        <w:t>("The FETCH system focuses on achieving this validated accuracy level of 94.3%.") with:</w:t>
+      </w:r>
+    </w:p>
+    <w:p>
+      <w:pPr>
+        <w:shd w:val="clear" w:color="auto" w:fill="EEF5EE"/>
+        <w:spacing w:line="480" w:lineRule="auto" w:after="0"/>
+      </w:pPr>
+      <w:r>
+        <w:rPr>
+          <w:i w:val="0"/>
+        </w:rPr>
+        <w:t>FETCH will adopt the same combination of Random Forest and Gradient Boosting and will measure the accuracy of its own forecasts on the sales of Risha Pet Supplies, so that its results can be compared with this benchmark.</w:t>
+      </w:r>
+    </w:p>
+    <w:p>
+      <w:pPr>
+        <w:keepNext/>
+        <w:spacing w:before="280" w:after="80"/>
+      </w:pPr>
+      <w:r>
+        <w:rPr>
+          <w:b/>
+          <w:color w:val="0F2E17"/>
+          <w:sz w:val="28"/>
+        </w:rPr>
+        <w:t>21. Predictive Analytics and AI-Driven Forecasting in Retail: the automatic reorder (page 7)</w:t>
+      </w:r>
+    </w:p>
+    <w:p>
+      <w:pPr>
+        <w:spacing w:after="60"/>
+      </w:pPr>
+      <w:r>
+        <w:rPr>
+          <w:b/>
+          <w:sz w:val="22"/>
+        </w:rPr>
+        <w:t xml:space="preserve">Why: </w:t>
+      </w:r>
+      <w:r>
+        <w:rPr>
+          <w:sz w:val="22"/>
+        </w:rPr>
+        <w:t>The reordering in FETCH is automatic: when the owner presses Reorder and confirms, the system finds the products at or below their reorder level, works out how many of each to order from the forecast and the sales, creates one purchase order for each supplier and emails it to them. It does not start by itself, so the sentence says the owner confirms it once.</w:t>
+      </w:r>
+    </w:p>
+    <w:p>
+      <w:pPr>
+        <w:spacing w:after="60"/>
+      </w:pPr>
+      <w:r>
+        <w:rPr>
+          <w:b/>
+          <w:sz w:val="22"/>
+        </w:rPr>
+        <w:t xml:space="preserve">Replace the last sentence of the paragraph </w:t>
+      </w:r>
+      <w:r>
+        <w:rPr>
+          <w:sz w:val="22"/>
+        </w:rPr>
+        <w:t>("Thus, the automatic reorder system places automatic orders…") with:</w:t>
+      </w:r>
+    </w:p>
+    <w:p>
+      <w:pPr>
+        <w:shd w:val="clear" w:color="auto" w:fill="EEF5EE"/>
+        <w:spacing w:line="480" w:lineRule="auto" w:after="0"/>
+      </w:pPr>
+      <w:r>
+        <w:rPr>
+          <w:i w:val="0"/>
+        </w:rPr>
+        <w:t>Thus, the automatic reorder feature of FETCH will find the products that have reached their reorder level, work out how many of each to order from the AI forecast, and create and email a purchase order to each supplier once the owner confirms, avoiding delays caused by human error.</w:t>
+      </w:r>
+    </w:p>
+    <w:p>
+      <w:pPr>
+        <w:keepNext/>
+        <w:spacing w:before="280" w:after="80"/>
+      </w:pPr>
+      <w:r>
+        <w:rPr>
+          <w:b/>
+          <w:color w:val="0F2E17"/>
+          <w:sz w:val="28"/>
+        </w:rPr>
+        <w:t>22. Pet Retail Industry: "ScanBarcode" (page 9)</w:t>
+      </w:r>
+    </w:p>
+    <w:p>
+      <w:pPr>
+        <w:spacing w:after="60"/>
+      </w:pPr>
+      <w:r>
+        <w:rPr>
+          <w:b/>
+          <w:sz w:val="22"/>
+        </w:rPr>
+        <w:t xml:space="preserve">Why: </w:t>
+      </w:r>
+      <w:r>
+        <w:rPr>
+          <w:sz w:val="22"/>
+        </w:rPr>
+        <w:t>"ScanBarcode" reads like the name of a product. The feature is barcode scanning.</w:t>
+      </w:r>
+    </w:p>
+    <w:p>
+      <w:pPr>
+        <w:spacing w:after="60"/>
+      </w:pPr>
+      <w:r>
+        <w:rPr>
+          <w:b/>
+          <w:sz w:val="22"/>
+        </w:rPr>
+        <w:t xml:space="preserve">Replace the first sentence on page 9 </w:t>
+      </w:r>
+      <w:r>
+        <w:rPr>
+          <w:sz w:val="22"/>
+        </w:rPr>
+        <w:t>("Industry-related challenges offer a need … Automatic Reorder tackles the issue of Overstocking with less likelihood of Stockout.") with:</w:t>
+      </w:r>
+    </w:p>
+    <w:p>
+      <w:pPr>
+        <w:shd w:val="clear" w:color="auto" w:fill="EEF5EE"/>
+        <w:spacing w:line="480" w:lineRule="auto" w:after="0"/>
+      </w:pPr>
+      <w:r>
+        <w:rPr>
+          <w:i w:val="0"/>
+        </w:rPr>
+        <w:t>Industry-related challenges offer a need for the development of FETCH. Pattern Learning deals with the Seasonal Variability issue, Barcode Scanning is capable of handling many SKUs along with the expiration date, and Automatic Reorder tackles the issue of Overstocking with less likelihood of Stockout.</w:t>
+      </w:r>
+    </w:p>
+    <w:p>
+      <w:pPr>
+        <w:keepNext/>
+        <w:spacing w:before="280" w:after="80"/>
+      </w:pPr>
+      <w:r>
+        <w:rPr>
+          <w:b/>
+          <w:color w:val="0F2E17"/>
+          <w:sz w:val="28"/>
+        </w:rPr>
         <w:t>References to add</w:t>
       </w:r>
     </w:p>
@@ -3430,66 +3817,6 @@
           <w:sz w:val="28"/>
         </w:rPr>
         <w:t>Not changed, but worth a look before the defense</w:t>
-      </w:r>
-    </w:p>
-    <w:p>
-      <w:pPr>
-        <w:pStyle w:val="ListBullet"/>
-        <w:spacing w:after="40"/>
-      </w:pPr>
-      <w:r>
-        <w:rPr>
-          <w:b/>
-          <w:sz w:val="22"/>
-        </w:rPr>
-        <w:t>Page 6:</w:t>
-      </w:r>
-      <w:r>
-        <w:rPr>
-          <w:b w:val="0"/>
-          <w:sz w:val="22"/>
-        </w:rPr>
-        <w:t xml:space="preserve"> "The FETCH system focuses on achieving this validated accuracy level of 94.3%." The forecast page measured 86.1% for 27 Sep to 10 Oct (QA/FORECAST-METHOD.md). The panel may ask, so consider: "FETCH aims for an accuracy close to this level."</w:t>
-      </w:r>
-    </w:p>
-    <w:p>
-      <w:pPr>
-        <w:pStyle w:val="ListBullet"/>
-        <w:spacing w:after="40"/>
-      </w:pPr>
-      <w:r>
-        <w:rPr>
-          <w:b/>
-          <w:sz w:val="22"/>
-        </w:rPr>
-        <w:t>Page 7:</w:t>
-      </w:r>
-      <w:r>
-        <w:rPr>
-          <w:b w:val="0"/>
-          <w:sz w:val="22"/>
-        </w:rPr>
-        <w:t xml:space="preserve"> "the automatic reorder system places automatic orders". In FETCH the owner reviews the reorder list and creates the purchase orders with one click; consider "prepares purchase orders that the owner approves".</w:t>
-      </w:r>
-    </w:p>
-    <w:p>
-      <w:pPr>
-        <w:pStyle w:val="ListBullet"/>
-        <w:spacing w:after="40"/>
-      </w:pPr>
-      <w:r>
-        <w:rPr>
-          <w:b/>
-          <w:sz w:val="22"/>
-        </w:rPr>
-        <w:t>Page 9:</w:t>
-      </w:r>
-      <w:r>
-        <w:rPr>
-          <w:b w:val="0"/>
-          <w:sz w:val="22"/>
-        </w:rPr>
-        <w:t xml:space="preserve"> "ScanBarcode" reads like a product name; "barcode scanning" is clearer.</w:t>
       </w:r>
     </w:p>
     <w:p>
@@ -3510,26 +3837,6 @@
           <w:sz w:val="22"/>
         </w:rPr>
         <w:t xml:space="preserve"> the tone is casual for a thesis ("doing really well now", "Think about what it takes"), and "Intelligence and machine learning" should be "Artificial intelligence and machine learning".</w:t>
-      </w:r>
-    </w:p>
-    <w:p>
-      <w:pPr>
-        <w:pStyle w:val="ListBullet"/>
-        <w:spacing w:after="40"/>
-      </w:pPr>
-      <w:r>
-        <w:rPr>
-          <w:b/>
-          <w:sz w:val="22"/>
-        </w:rPr>
-        <w:t>Tense:</w:t>
-      </w:r>
-      <w:r>
-        <w:rPr>
-          <w:b w:val="0"/>
-          <w:sz w:val="22"/>
-        </w:rPr>
-        <w:t xml:space="preserve"> the paper says the system "will" be built, but the consent form says it is already live. The reference paper uses the past tense in Chapter 2 for work already done. Ask your adviser which they want.</w:t>
       </w:r>
     </w:p>
     <w:sectPr>

</xml_diff>